<commit_message>
v1.0.2: add <Effective Date> keyword, fix tmp folder, fix zero rebate amount formatting
</commit_message>
<xml_diff>
--- a/data/template/Rebate Agreement Update Form_5.08.25 updated0205.docx
+++ b/data/template/Rebate Agreement Update Form_5.08.25 updated0205.docx
@@ -502,32 +502,34 @@
           <w:szCs w:val="20"/>
           <w:lang w:eastAsia="zh-TW"/>
         </w:rPr>
-        <w:t xml:space="preserve"> Feb</w:t>
-      </w:r>
-      <w:r>
-        <w:rPr>
-          <w:rFonts w:ascii="Arial" w:hAnsi="Arial" w:cs="Arial"/>
-          <w:color w:val="000000"/>
-          <w:szCs w:val="20"/>
-        </w:rPr>
-        <w:t xml:space="preserve"> 202</w:t>
+        <w:t xml:space="preserve"> </w:t>
       </w:r>
       <w:r>
         <w:rPr>
           <w:rFonts w:ascii="Arial" w:eastAsia="PMingLiU" w:hAnsi="Arial" w:cs="Arial" w:hint="eastAsia"/>
           <w:color w:val="000000"/>
           <w:szCs w:val="20"/>
+          <w:highlight w:val="yellow"/>
           <w:lang w:eastAsia="zh-TW"/>
         </w:rPr>
-        <w:t>6</w:t>
-      </w:r>
-      <w:r>
-        <w:rPr>
-          <w:rFonts w:ascii="Arial" w:hAnsi="Arial" w:cs="Arial"/>
-          <w:color w:val="000000"/>
-          <w:szCs w:val="20"/>
-        </w:rPr>
-        <w:t xml:space="preserve"> (“</w:t>
+        <w:t>&lt;Effective Date&gt;</w:t>
+      </w:r>
+      <w:r>
+        <w:rPr>
+          <w:rFonts w:ascii="Arial" w:eastAsia="PMingLiU" w:hAnsi="Arial" w:cs="Arial" w:hint="eastAsia"/>
+          <w:color w:val="000000"/>
+          <w:szCs w:val="20"/>
+          <w:lang w:eastAsia="zh-TW"/>
+        </w:rPr>
+        <w:t xml:space="preserve"> </w:t>
+      </w:r>
+      <w:r>
+        <w:rPr>
+          <w:rFonts w:ascii="Arial" w:hAnsi="Arial" w:cs="Arial"/>
+          <w:color w:val="000000"/>
+          <w:szCs w:val="20"/>
+        </w:rPr>
+        <w:t>(“</w:t>
       </w:r>
       <w:r>
         <w:rPr>
@@ -599,18 +601,8 @@
           <w:color w:val="000000"/>
           <w:szCs w:val="20"/>
         </w:rPr>
-        <w:t xml:space="preserve">WHEREAS, HP and Supplier have previously entered into the </w:t>
-      </w:r>
-      <w:proofErr w:type="gramStart"/>
-      <w:r>
-        <w:rPr>
-          <w:rFonts w:ascii="Arial" w:hAnsi="Arial" w:cs="Arial"/>
-          <w:color w:val="000000"/>
-          <w:szCs w:val="20"/>
-        </w:rPr>
-        <w:t>Agreement;</w:t>
-      </w:r>
-      <w:proofErr w:type="gramEnd"/>
+        <w:t>WHEREAS, HP and Supplier have previously entered into the Agreement;</w:t>
+      </w:r>
     </w:p>
     <w:p>
       <w:pPr>
@@ -4549,12 +4541,14 @@
 </file>
 
 <file path=customXml/item1.xml><?xml version="1.0" encoding="utf-8"?>
-<?mso-contentType ?>
-<FormTemplates xmlns="http://schemas.microsoft.com/sharepoint/v3/contenttype/forms">
-  <Display>DocumentLibraryForm</Display>
-  <Edit>DocumentLibraryForm</Edit>
-  <New>DocumentLibraryForm</New>
-</FormTemplates>
+<p:properties xmlns:p="http://schemas.microsoft.com/office/2006/metadata/properties" xmlns:xsi="http://www.w3.org/2001/XMLSchema-instance">
+  <documentManagement>
+    <lcf76f155ced4ddcb4097134ff3c332f xmlns="3ddbdfa1-be50-4b7a-b66f-14c4748c8596">
+      <Terms xmlns="http://schemas.microsoft.com/office/infopath/2007/PartnerControls"/>
+    </lcf76f155ced4ddcb4097134ff3c332f>
+    <TaxCatchAll xmlns="2df2684a-2237-489e-8795-1f946593e18f" xsi:nil="true"/>
+  </documentManagement>
+</p:properties>
 </file>
 
 <file path=customXml/item2.xml><?xml version="1.0" encoding="utf-8"?>
@@ -4787,14 +4781,12 @@
 </file>
 
 <file path=customXml/item3.xml><?xml version="1.0" encoding="utf-8"?>
-<p:properties xmlns:p="http://schemas.microsoft.com/office/2006/metadata/properties" xmlns:xsi="http://www.w3.org/2001/XMLSchema-instance">
-  <documentManagement>
-    <lcf76f155ced4ddcb4097134ff3c332f xmlns="3ddbdfa1-be50-4b7a-b66f-14c4748c8596">
-      <Terms xmlns="http://schemas.microsoft.com/office/infopath/2007/PartnerControls"/>
-    </lcf76f155ced4ddcb4097134ff3c332f>
-    <TaxCatchAll xmlns="2df2684a-2237-489e-8795-1f946593e18f" xsi:nil="true"/>
-  </documentManagement>
-</p:properties>
+<?mso-contentType ?>
+<FormTemplates xmlns="http://schemas.microsoft.com/sharepoint/v3/contenttype/forms">
+  <Display>DocumentLibraryForm</Display>
+  <Edit>DocumentLibraryForm</Edit>
+  <New>DocumentLibraryForm</New>
+</FormTemplates>
 </file>
 
 <file path=customXml/item4.xml><?xml version="1.0" encoding="utf-8"?>
@@ -4802,24 +4794,39 @@
 </file>
 
 <file path=customXml/itemProps1.xml><?xml version="1.0" encoding="utf-8"?>
-<ds:datastoreItem xmlns:ds="http://schemas.openxmlformats.org/officeDocument/2006/customXml" ds:itemID="{FFDB335C-122B-4C8E-B931-4F043DE30D9D}">
+<ds:datastoreItem xmlns:ds="http://schemas.openxmlformats.org/officeDocument/2006/customXml" ds:itemID="{A8D4C279-A7E0-4E9E-BDDB-F633470021CF}">
   <ds:schemaRefs>
-    <ds:schemaRef ds:uri="http://schemas.microsoft.com/sharepoint/v3/contenttype/forms"/>
+    <ds:schemaRef ds:uri="http://schemas.microsoft.com/office/2006/metadata/properties"/>
+    <ds:schemaRef ds:uri="3ddbdfa1-be50-4b7a-b66f-14c4748c8596"/>
+    <ds:schemaRef ds:uri="http://schemas.microsoft.com/office/infopath/2007/PartnerControls"/>
+    <ds:schemaRef ds:uri="2df2684a-2237-489e-8795-1f946593e18f"/>
   </ds:schemaRefs>
 </ds:datastoreItem>
 </file>
 
 <file path=customXml/itemProps2.xml><?xml version="1.0" encoding="utf-8"?>
-<ds:datastoreItem xmlns:ds="http://schemas.openxmlformats.org/officeDocument/2006/customXml" ds:itemID="{020821EB-3E1B-4EB8-8007-9504BC8286C3}"/>
+<ds:datastoreItem xmlns:ds="http://schemas.openxmlformats.org/officeDocument/2006/customXml" ds:itemID="{020821EB-3E1B-4EB8-8007-9504BC8286C3}">
+  <ds:schemaRefs>
+    <ds:schemaRef ds:uri="http://schemas.microsoft.com/office/2006/metadata/contentType"/>
+    <ds:schemaRef ds:uri="http://schemas.microsoft.com/office/2006/metadata/properties/metaAttributes"/>
+    <ds:schemaRef ds:uri="http://www.w3.org/2001/XMLSchema"/>
+    <ds:schemaRef ds:uri="http://schemas.microsoft.com/office/2006/metadata/properties"/>
+    <ds:schemaRef ds:uri="3ddbdfa1-be50-4b7a-b66f-14c4748c8596"/>
+    <ds:schemaRef ds:uri="2df2684a-2237-489e-8795-1f946593e18f"/>
+    <ds:schemaRef ds:uri="http://schemas.microsoft.com/office/2006/documentManagement/types"/>
+    <ds:schemaRef ds:uri="http://schemas.microsoft.com/office/infopath/2007/PartnerControls"/>
+    <ds:schemaRef ds:uri="http://schemas.openxmlformats.org/package/2006/metadata/core-properties"/>
+    <ds:schemaRef ds:uri="http://purl.org/dc/elements/1.1/"/>
+    <ds:schemaRef ds:uri="http://purl.org/dc/terms/"/>
+    <ds:schemaRef ds:uri="http://schemas.microsoft.com/internal/obd"/>
+  </ds:schemaRefs>
+</ds:datastoreItem>
 </file>
 
 <file path=customXml/itemProps3.xml><?xml version="1.0" encoding="utf-8"?>
-<ds:datastoreItem xmlns:ds="http://schemas.openxmlformats.org/officeDocument/2006/customXml" ds:itemID="{A8D4C279-A7E0-4E9E-BDDB-F633470021CF}">
+<ds:datastoreItem xmlns:ds="http://schemas.openxmlformats.org/officeDocument/2006/customXml" ds:itemID="{FFDB335C-122B-4C8E-B931-4F043DE30D9D}">
   <ds:schemaRefs>
-    <ds:schemaRef ds:uri="http://schemas.microsoft.com/office/2006/metadata/properties"/>
-    <ds:schemaRef ds:uri="beeb5188-3ef8-4c9a-af7a-198f82a0c334"/>
-    <ds:schemaRef ds:uri="http://schemas.microsoft.com/office/infopath/2007/PartnerControls"/>
-    <ds:schemaRef ds:uri="64fe8c59-3550-437a-9cc1-69277fe2ea73"/>
+    <ds:schemaRef ds:uri="http://schemas.microsoft.com/sharepoint/v3/contenttype/forms"/>
   </ds:schemaRefs>
 </ds:datastoreItem>
 </file>

</xml_diff>

<commit_message>
chore: update supplier info + Word template (v1.0.6)
</commit_message>
<xml_diff>
--- a/data/template/Rebate Agreement Update Form_5.08.25 updated0205.docx
+++ b/data/template/Rebate Agreement Update Form_5.08.25 updated0205.docx
@@ -1984,12 +1984,12 @@
       </w:tblPr>
       <w:tblGrid>
         <w:gridCol w:w="806"/>
-        <w:gridCol w:w="1692"/>
+        <w:gridCol w:w="1693"/>
         <w:gridCol w:w="1780"/>
         <w:gridCol w:w="389"/>
         <w:gridCol w:w="806"/>
         <w:gridCol w:w="1352"/>
-        <w:gridCol w:w="2535"/>
+        <w:gridCol w:w="2534"/>
       </w:tblGrid>
       <w:tr>
         <w:tc>
@@ -2354,14 +2354,16 @@
           <w:p>
             <w:pPr>
               <w:rPr>
-                <w:rFonts w:ascii="Arial" w:hAnsi="Arial" w:cs="Arial"/>
+                <w:rFonts w:ascii="Arial" w:eastAsia="PMingLiU" w:hAnsi="Arial" w:cs="Arial" w:hint="eastAsia"/>
+                <w:lang w:eastAsia="zh-TW"/>
               </w:rPr>
             </w:pPr>
             <w:r>
               <w:rPr>
-                <w:rFonts w:ascii="Arial" w:hAnsi="Arial" w:cs="Arial"/>
-              </w:rPr>
-              <w:t>Todd Flynn</w:t>
+                <w:rFonts w:ascii="Arial" w:eastAsia="PMingLiU" w:hAnsi="Arial" w:cs="Arial" w:hint="eastAsia"/>
+                <w:lang w:eastAsia="zh-TW"/>
+              </w:rPr>
+              <w:t>David Stradal</w:t>
             </w:r>
           </w:p>
         </w:tc>
@@ -2521,14 +2523,16 @@
           <w:p>
             <w:pPr>
               <w:rPr>
-                <w:rFonts w:ascii="Arial" w:hAnsi="Arial" w:cs="Arial"/>
+                <w:rFonts w:ascii="Arial" w:eastAsia="PMingLiU" w:hAnsi="Arial" w:cs="Arial" w:hint="eastAsia"/>
+                <w:lang w:eastAsia="zh-TW"/>
               </w:rPr>
             </w:pPr>
             <w:r>
               <w:rPr>
-                <w:rFonts w:ascii="Arial" w:hAnsi="Arial" w:cs="Arial"/>
-              </w:rPr>
-              <w:t>Senior Manager</w:t>
+                <w:rFonts w:ascii="Arial" w:eastAsia="PMingLiU" w:hAnsi="Arial" w:cs="Arial" w:hint="eastAsia"/>
+                <w:lang w:eastAsia="zh-TW"/>
+              </w:rPr>
+              <w:t>Sr. Procurement Manager</w:t>
             </w:r>
           </w:p>
         </w:tc>
@@ -4541,14 +4545,12 @@
 </file>
 
 <file path=customXml/item1.xml><?xml version="1.0" encoding="utf-8"?>
-<p:properties xmlns:p="http://schemas.microsoft.com/office/2006/metadata/properties" xmlns:xsi="http://www.w3.org/2001/XMLSchema-instance">
-  <documentManagement>
-    <lcf76f155ced4ddcb4097134ff3c332f xmlns="3ddbdfa1-be50-4b7a-b66f-14c4748c8596">
-      <Terms xmlns="http://schemas.microsoft.com/office/infopath/2007/PartnerControls"/>
-    </lcf76f155ced4ddcb4097134ff3c332f>
-    <TaxCatchAll xmlns="2df2684a-2237-489e-8795-1f946593e18f" xsi:nil="true"/>
-  </documentManagement>
-</p:properties>
+<?mso-contentType ?>
+<FormTemplates xmlns="http://schemas.microsoft.com/sharepoint/v3/contenttype/forms">
+  <Display>DocumentLibraryForm</Display>
+  <Edit>DocumentLibraryForm</Edit>
+  <New>DocumentLibraryForm</New>
+</FormTemplates>
 </file>
 
 <file path=customXml/item2.xml><?xml version="1.0" encoding="utf-8"?>
@@ -4781,12 +4783,14 @@
 </file>
 
 <file path=customXml/item3.xml><?xml version="1.0" encoding="utf-8"?>
-<?mso-contentType ?>
-<FormTemplates xmlns="http://schemas.microsoft.com/sharepoint/v3/contenttype/forms">
-  <Display>DocumentLibraryForm</Display>
-  <Edit>DocumentLibraryForm</Edit>
-  <New>DocumentLibraryForm</New>
-</FormTemplates>
+<p:properties xmlns:p="http://schemas.microsoft.com/office/2006/metadata/properties" xmlns:xsi="http://www.w3.org/2001/XMLSchema-instance">
+  <documentManagement>
+    <lcf76f155ced4ddcb4097134ff3c332f xmlns="3ddbdfa1-be50-4b7a-b66f-14c4748c8596">
+      <Terms xmlns="http://schemas.microsoft.com/office/infopath/2007/PartnerControls"/>
+    </lcf76f155ced4ddcb4097134ff3c332f>
+    <TaxCatchAll xmlns="2df2684a-2237-489e-8795-1f946593e18f" xsi:nil="true"/>
+  </documentManagement>
+</p:properties>
 </file>
 
 <file path=customXml/item4.xml><?xml version="1.0" encoding="utf-8"?>
@@ -4794,12 +4798,9 @@
 </file>
 
 <file path=customXml/itemProps1.xml><?xml version="1.0" encoding="utf-8"?>
-<ds:datastoreItem xmlns:ds="http://schemas.openxmlformats.org/officeDocument/2006/customXml" ds:itemID="{A8D4C279-A7E0-4E9E-BDDB-F633470021CF}">
+<ds:datastoreItem xmlns:ds="http://schemas.openxmlformats.org/officeDocument/2006/customXml" ds:itemID="{FFDB335C-122B-4C8E-B931-4F043DE30D9D}">
   <ds:schemaRefs>
-    <ds:schemaRef ds:uri="http://schemas.microsoft.com/office/2006/metadata/properties"/>
-    <ds:schemaRef ds:uri="3ddbdfa1-be50-4b7a-b66f-14c4748c8596"/>
-    <ds:schemaRef ds:uri="http://schemas.microsoft.com/office/infopath/2007/PartnerControls"/>
-    <ds:schemaRef ds:uri="2df2684a-2237-489e-8795-1f946593e18f"/>
+    <ds:schemaRef ds:uri="http://schemas.microsoft.com/sharepoint/v3/contenttype/forms"/>
   </ds:schemaRefs>
 </ds:datastoreItem>
 </file>
@@ -4824,9 +4825,12 @@
 </file>
 
 <file path=customXml/itemProps3.xml><?xml version="1.0" encoding="utf-8"?>
-<ds:datastoreItem xmlns:ds="http://schemas.openxmlformats.org/officeDocument/2006/customXml" ds:itemID="{FFDB335C-122B-4C8E-B931-4F043DE30D9D}">
+<ds:datastoreItem xmlns:ds="http://schemas.openxmlformats.org/officeDocument/2006/customXml" ds:itemID="{A8D4C279-A7E0-4E9E-BDDB-F633470021CF}">
   <ds:schemaRefs>
-    <ds:schemaRef ds:uri="http://schemas.microsoft.com/sharepoint/v3/contenttype/forms"/>
+    <ds:schemaRef ds:uri="http://schemas.microsoft.com/office/2006/metadata/properties"/>
+    <ds:schemaRef ds:uri="3ddbdfa1-be50-4b7a-b66f-14c4748c8596"/>
+    <ds:schemaRef ds:uri="http://schemas.microsoft.com/office/infopath/2007/PartnerControls"/>
+    <ds:schemaRef ds:uri="2df2684a-2237-489e-8795-1f946593e18f"/>
   </ds:schemaRefs>
 </ds:datastoreItem>
 </file>

</xml_diff>

<commit_message>
feat: drop constant columns in contract input, round price to 2dp, Size as integer in Word, Color as default column, update template (v1.0.7)
</commit_message>
<xml_diff>
--- a/data/template/Rebate Agreement Update Form_5.08.25 updated0205.docx
+++ b/data/template/Rebate Agreement Update Form_5.08.25 updated0205.docx
@@ -1087,14 +1087,14 @@
       </w:tblPr>
       <w:tblGrid>
         <w:gridCol w:w="900"/>
-        <w:gridCol w:w="1080"/>
-        <w:gridCol w:w="1530"/>
-        <w:gridCol w:w="1710"/>
+        <w:gridCol w:w="1350"/>
+        <w:gridCol w:w="1620"/>
         <w:gridCol w:w="990"/>
         <w:gridCol w:w="810"/>
+        <w:gridCol w:w="1800"/>
         <w:gridCol w:w="1350"/>
-        <w:gridCol w:w="1260"/>
-        <w:gridCol w:w="1170"/>
+        <w:gridCol w:w="900"/>
+        <w:gridCol w:w="1080"/>
       </w:tblGrid>
       <w:tr>
         <w:trPr>
@@ -1139,6 +1139,285 @@
         </w:tc>
         <w:tc>
           <w:tcPr>
+            <w:tcW w:w="1350" w:type="dxa"/>
+            <w:tcBorders>
+              <w:top w:val="single" w:sz="4" w:space="0" w:color="auto"/>
+              <w:left w:val="single" w:sz="4" w:space="0" w:color="auto"/>
+              <w:bottom w:val="single" w:sz="4" w:space="0" w:color="auto"/>
+              <w:right w:val="single" w:sz="4" w:space="0" w:color="auto"/>
+            </w:tcBorders>
+            <w:vAlign w:val="center"/>
+            <w:hideMark/>
+          </w:tcPr>
+          <w:p>
+            <w:pPr>
+              <w:jc w:val="center"/>
+              <w:rPr>
+                <w:rFonts w:eastAsia="PMingLiU"/>
+                <w:b/>
+                <w:bCs/>
+                <w:sz w:val="16"/>
+                <w:szCs w:val="16"/>
+                <w:lang w:eastAsia="zh-TW"/>
+              </w:rPr>
+            </w:pPr>
+            <w:r>
+              <w:rPr>
+                <w:rFonts w:eastAsia="PMingLiU"/>
+                <w:b/>
+                <w:bCs/>
+                <w:sz w:val="16"/>
+                <w:szCs w:val="16"/>
+                <w:lang w:eastAsia="zh-TW"/>
+              </w:rPr>
+              <w:t>HP/ODM Part#</w:t>
+            </w:r>
+          </w:p>
+        </w:tc>
+        <w:tc>
+          <w:tcPr>
+            <w:tcW w:w="1620" w:type="dxa"/>
+            <w:tcBorders>
+              <w:top w:val="single" w:sz="4" w:space="0" w:color="auto"/>
+              <w:left w:val="single" w:sz="4" w:space="0" w:color="auto"/>
+              <w:bottom w:val="single" w:sz="4" w:space="0" w:color="auto"/>
+              <w:right w:val="single" w:sz="4" w:space="0" w:color="auto"/>
+            </w:tcBorders>
+            <w:vAlign w:val="center"/>
+          </w:tcPr>
+          <w:p>
+            <w:pPr>
+              <w:jc w:val="center"/>
+              <w:rPr>
+                <w:rFonts w:eastAsia="PMingLiU"/>
+                <w:b/>
+                <w:bCs/>
+                <w:sz w:val="16"/>
+                <w:szCs w:val="16"/>
+                <w:lang w:eastAsia="zh-TW"/>
+              </w:rPr>
+            </w:pPr>
+            <w:r>
+              <w:rPr>
+                <w:rFonts w:eastAsia="PMingLiU"/>
+                <w:b/>
+                <w:bCs/>
+                <w:sz w:val="16"/>
+                <w:szCs w:val="16"/>
+                <w:lang w:eastAsia="zh-TW"/>
+              </w:rPr>
+              <w:t>Platforms</w:t>
+            </w:r>
+          </w:p>
+        </w:tc>
+        <w:tc>
+          <w:tcPr>
+            <w:tcW w:w="990" w:type="dxa"/>
+            <w:tcBorders>
+              <w:top w:val="single" w:sz="4" w:space="0" w:color="auto"/>
+              <w:left w:val="single" w:sz="4" w:space="0" w:color="auto"/>
+              <w:bottom w:val="single" w:sz="4" w:space="0" w:color="auto"/>
+              <w:right w:val="single" w:sz="4" w:space="0" w:color="auto"/>
+            </w:tcBorders>
+            <w:vAlign w:val="center"/>
+          </w:tcPr>
+          <w:p>
+            <w:pPr>
+              <w:jc w:val="center"/>
+              <w:rPr>
+                <w:rFonts w:eastAsia="PMingLiU"/>
+                <w:b/>
+                <w:bCs/>
+                <w:sz w:val="16"/>
+                <w:szCs w:val="16"/>
+                <w:lang w:eastAsia="zh-TW"/>
+              </w:rPr>
+            </w:pPr>
+            <w:r>
+              <w:rPr>
+                <w:rFonts w:eastAsia="PMingLiU"/>
+                <w:b/>
+                <w:bCs/>
+                <w:sz w:val="16"/>
+                <w:szCs w:val="16"/>
+                <w:lang w:eastAsia="zh-TW"/>
+              </w:rPr>
+              <w:t>Product</w:t>
+            </w:r>
+          </w:p>
+        </w:tc>
+        <w:tc>
+          <w:tcPr>
+            <w:tcW w:w="810" w:type="dxa"/>
+            <w:tcBorders>
+              <w:top w:val="single" w:sz="4" w:space="0" w:color="auto"/>
+              <w:left w:val="single" w:sz="4" w:space="0" w:color="auto"/>
+              <w:bottom w:val="single" w:sz="4" w:space="0" w:color="auto"/>
+              <w:right w:val="single" w:sz="4" w:space="0" w:color="auto"/>
+            </w:tcBorders>
+            <w:vAlign w:val="center"/>
+          </w:tcPr>
+          <w:p>
+            <w:pPr>
+              <w:jc w:val="center"/>
+              <w:rPr>
+                <w:rFonts w:eastAsia="PMingLiU"/>
+                <w:b/>
+                <w:bCs/>
+                <w:sz w:val="16"/>
+                <w:szCs w:val="16"/>
+                <w:lang w:eastAsia="zh-TW"/>
+              </w:rPr>
+            </w:pPr>
+            <w:r>
+              <w:rPr>
+                <w:rFonts w:eastAsia="PMingLiU"/>
+                <w:b/>
+                <w:bCs/>
+                <w:sz w:val="16"/>
+                <w:szCs w:val="16"/>
+                <w:lang w:eastAsia="zh-TW"/>
+              </w:rPr>
+              <w:t>Size</w:t>
+            </w:r>
+          </w:p>
+        </w:tc>
+        <w:tc>
+          <w:tcPr>
+            <w:tcW w:w="1800" w:type="dxa"/>
+            <w:tcBorders>
+              <w:top w:val="single" w:sz="4" w:space="0" w:color="auto"/>
+              <w:left w:val="single" w:sz="4" w:space="0" w:color="auto"/>
+              <w:bottom w:val="single" w:sz="4" w:space="0" w:color="auto"/>
+              <w:right w:val="single" w:sz="4" w:space="0" w:color="auto"/>
+            </w:tcBorders>
+            <w:vAlign w:val="center"/>
+          </w:tcPr>
+          <w:p>
+            <w:pPr>
+              <w:jc w:val="center"/>
+              <w:rPr>
+                <w:rFonts w:eastAsia="PMingLiU"/>
+                <w:b/>
+                <w:bCs/>
+                <w:sz w:val="16"/>
+                <w:szCs w:val="16"/>
+                <w:lang w:eastAsia="zh-TW"/>
+              </w:rPr>
+            </w:pPr>
+            <w:r>
+              <w:rPr>
+                <w:rFonts w:eastAsia="PMingLiU" w:hint="eastAsia"/>
+                <w:b/>
+                <w:bCs/>
+                <w:sz w:val="16"/>
+                <w:szCs w:val="16"/>
+                <w:lang w:eastAsia="zh-TW"/>
+              </w:rPr>
+              <w:t>Color</w:t>
+            </w:r>
+          </w:p>
+        </w:tc>
+        <w:tc>
+          <w:tcPr>
+            <w:tcW w:w="1350" w:type="dxa"/>
+            <w:tcBorders>
+              <w:top w:val="single" w:sz="4" w:space="0" w:color="auto"/>
+              <w:left w:val="single" w:sz="4" w:space="0" w:color="auto"/>
+              <w:bottom w:val="single" w:sz="4" w:space="0" w:color="auto"/>
+              <w:right w:val="single" w:sz="4" w:space="0" w:color="auto"/>
+            </w:tcBorders>
+            <w:vAlign w:val="center"/>
+            <w:hideMark/>
+          </w:tcPr>
+          <w:p>
+            <w:pPr>
+              <w:jc w:val="center"/>
+              <w:rPr>
+                <w:rFonts w:eastAsia="PMingLiU"/>
+                <w:b/>
+                <w:bCs/>
+                <w:sz w:val="16"/>
+                <w:szCs w:val="16"/>
+                <w:lang w:eastAsia="zh-TW"/>
+              </w:rPr>
+            </w:pPr>
+            <w:r>
+              <w:rPr>
+                <w:rFonts w:eastAsia="PMingLiU"/>
+                <w:b/>
+                <w:bCs/>
+                <w:sz w:val="16"/>
+                <w:szCs w:val="16"/>
+                <w:lang w:eastAsia="zh-TW"/>
+              </w:rPr>
+              <w:t>ODM</w:t>
+            </w:r>
+          </w:p>
+          <w:p>
+            <w:pPr>
+              <w:jc w:val="center"/>
+              <w:rPr>
+                <w:rFonts w:eastAsia="PMingLiU"/>
+                <w:b/>
+                <w:bCs/>
+                <w:sz w:val="16"/>
+                <w:szCs w:val="16"/>
+                <w:lang w:eastAsia="zh-TW"/>
+              </w:rPr>
+            </w:pPr>
+            <w:r>
+              <w:rPr>
+                <w:rFonts w:eastAsia="PMingLiU"/>
+                <w:b/>
+                <w:bCs/>
+                <w:sz w:val="16"/>
+                <w:szCs w:val="16"/>
+                <w:lang w:eastAsia="zh-TW"/>
+              </w:rPr>
+              <w:t>(Regional site)</w:t>
+            </w:r>
+          </w:p>
+        </w:tc>
+        <w:tc>
+          <w:tcPr>
+            <w:tcW w:w="900" w:type="dxa"/>
+            <w:tcBorders>
+              <w:top w:val="single" w:sz="4" w:space="0" w:color="auto"/>
+              <w:left w:val="single" w:sz="4" w:space="0" w:color="auto"/>
+              <w:bottom w:val="single" w:sz="4" w:space="0" w:color="auto"/>
+              <w:right w:val="single" w:sz="4" w:space="0" w:color="auto"/>
+            </w:tcBorders>
+            <w:vAlign w:val="center"/>
+            <w:hideMark/>
+          </w:tcPr>
+          <w:p>
+            <w:pPr>
+              <w:jc w:val="center"/>
+              <w:rPr>
+                <w:rFonts w:eastAsia="PMingLiU"/>
+                <w:b/>
+                <w:bCs/>
+                <w:sz w:val="16"/>
+                <w:szCs w:val="16"/>
+                <w:lang w:eastAsia="zh-TW"/>
+              </w:rPr>
+            </w:pPr>
+            <w:r>
+              <w:rPr>
+                <w:rFonts w:eastAsia="PMingLiU"/>
+                <w:b/>
+                <w:bCs/>
+                <w:sz w:val="16"/>
+                <w:szCs w:val="16"/>
+                <w:lang w:eastAsia="zh-TW"/>
+              </w:rPr>
+              <w:t>Per-Unit Rebate Amount $USD</w:t>
+            </w:r>
+          </w:p>
+        </w:tc>
+        <w:tc>
+          <w:tcPr>
             <w:tcW w:w="1080" w:type="dxa"/>
             <w:tcBorders>
               <w:top w:val="single" w:sz="4" w:space="0" w:color="auto"/>
@@ -1170,13 +1449,18 @@
                 <w:szCs w:val="16"/>
                 <w:lang w:eastAsia="zh-TW"/>
               </w:rPr>
-              <w:t>Category</w:t>
+              <w:t>Rebate Period Start Date</w:t>
             </w:r>
           </w:p>
         </w:tc>
-        <w:tc>
-          <w:tcPr>
-            <w:tcW w:w="1530" w:type="dxa"/>
+      </w:tr>
+      <w:tr>
+        <w:trPr>
+          <w:trHeight w:val="85"/>
+        </w:trPr>
+        <w:tc>
+          <w:tcPr>
+            <w:tcW w:w="900" w:type="dxa"/>
             <w:tcBorders>
               <w:top w:val="single" w:sz="4" w:space="0" w:color="auto"/>
               <w:left w:val="single" w:sz="4" w:space="0" w:color="auto"/>
@@ -1184,36 +1468,20 @@
               <w:right w:val="single" w:sz="4" w:space="0" w:color="auto"/>
             </w:tcBorders>
             <w:vAlign w:val="center"/>
-            <w:hideMark/>
           </w:tcPr>
           <w:p>
             <w:pPr>
               <w:jc w:val="center"/>
               <w:rPr>
                 <w:rFonts w:eastAsia="PMingLiU"/>
-                <w:b/>
-                <w:bCs/>
-                <w:sz w:val="16"/>
-                <w:szCs w:val="16"/>
                 <w:lang w:eastAsia="zh-TW"/>
               </w:rPr>
             </w:pPr>
-            <w:r>
-              <w:rPr>
-                <w:rFonts w:eastAsia="PMingLiU"/>
-                <w:b/>
-                <w:bCs/>
-                <w:sz w:val="16"/>
-                <w:szCs w:val="16"/>
-                <w:lang w:eastAsia="zh-TW"/>
-              </w:rPr>
-              <w:t>HP/ODM Part#</w:t>
-            </w:r>
-          </w:p>
-        </w:tc>
-        <w:tc>
-          <w:tcPr>
-            <w:tcW w:w="1710" w:type="dxa"/>
+          </w:p>
+        </w:tc>
+        <w:tc>
+          <w:tcPr>
+            <w:tcW w:w="1350" w:type="dxa"/>
             <w:tcBorders>
               <w:top w:val="single" w:sz="4" w:space="0" w:color="auto"/>
               <w:left w:val="single" w:sz="4" w:space="0" w:color="auto"/>
@@ -1221,31 +1489,28 @@
               <w:right w:val="single" w:sz="4" w:space="0" w:color="auto"/>
             </w:tcBorders>
             <w:vAlign w:val="center"/>
-            <w:hideMark/>
           </w:tcPr>
           <w:p>
             <w:pPr>
               <w:jc w:val="center"/>
-              <w:rPr>
-                <w:rFonts w:eastAsia="PMingLiU"/>
-                <w:b/>
-                <w:bCs/>
-                <w:sz w:val="16"/>
-                <w:szCs w:val="16"/>
-                <w:lang w:eastAsia="zh-TW"/>
-              </w:rPr>
-            </w:pPr>
-            <w:r>
-              <w:rPr>
-                <w:rFonts w:eastAsia="PMingLiU"/>
-                <w:b/>
-                <w:bCs/>
-                <w:sz w:val="16"/>
-                <w:szCs w:val="16"/>
-                <w:lang w:eastAsia="zh-TW"/>
-              </w:rPr>
-              <w:t>Platforms</w:t>
-            </w:r>
+            </w:pPr>
+          </w:p>
+        </w:tc>
+        <w:tc>
+          <w:tcPr>
+            <w:tcW w:w="1620" w:type="dxa"/>
+            <w:tcBorders>
+              <w:top w:val="single" w:sz="4" w:space="0" w:color="auto"/>
+              <w:left w:val="single" w:sz="4" w:space="0" w:color="auto"/>
+              <w:bottom w:val="single" w:sz="4" w:space="0" w:color="auto"/>
+              <w:right w:val="single" w:sz="4" w:space="0" w:color="auto"/>
+            </w:tcBorders>
+            <w:vAlign w:val="center"/>
+          </w:tcPr>
+          <w:p>
+            <w:pPr>
+              <w:jc w:val="center"/>
+            </w:pPr>
           </w:p>
         </w:tc>
         <w:tc>
@@ -1258,31 +1523,11 @@
               <w:right w:val="single" w:sz="4" w:space="0" w:color="auto"/>
             </w:tcBorders>
             <w:vAlign w:val="center"/>
-            <w:hideMark/>
           </w:tcPr>
           <w:p>
             <w:pPr>
               <w:jc w:val="center"/>
-              <w:rPr>
-                <w:rFonts w:eastAsia="PMingLiU"/>
-                <w:b/>
-                <w:bCs/>
-                <w:sz w:val="16"/>
-                <w:szCs w:val="16"/>
-                <w:lang w:eastAsia="zh-TW"/>
-              </w:rPr>
-            </w:pPr>
-            <w:r>
-              <w:rPr>
-                <w:rFonts w:eastAsia="PMingLiU"/>
-                <w:b/>
-                <w:bCs/>
-                <w:sz w:val="16"/>
-                <w:szCs w:val="16"/>
-                <w:lang w:eastAsia="zh-TW"/>
-              </w:rPr>
-              <w:t>Product</w:t>
-            </w:r>
+            </w:pPr>
           </w:p>
         </w:tc>
         <w:tc>
@@ -1295,31 +1540,32 @@
               <w:right w:val="single" w:sz="4" w:space="0" w:color="auto"/>
             </w:tcBorders>
             <w:vAlign w:val="center"/>
-            <w:hideMark/>
           </w:tcPr>
           <w:p>
             <w:pPr>
               <w:jc w:val="center"/>
               <w:rPr>
                 <w:rFonts w:eastAsia="PMingLiU"/>
-                <w:b/>
-                <w:bCs/>
-                <w:sz w:val="16"/>
-                <w:szCs w:val="16"/>
                 <w:lang w:eastAsia="zh-TW"/>
               </w:rPr>
             </w:pPr>
-            <w:r>
-              <w:rPr>
-                <w:rFonts w:eastAsia="PMingLiU"/>
-                <w:b/>
-                <w:bCs/>
-                <w:sz w:val="16"/>
-                <w:szCs w:val="16"/>
-                <w:lang w:eastAsia="zh-TW"/>
-              </w:rPr>
-              <w:t>Size</w:t>
-            </w:r>
+          </w:p>
+        </w:tc>
+        <w:tc>
+          <w:tcPr>
+            <w:tcW w:w="1800" w:type="dxa"/>
+            <w:tcBorders>
+              <w:top w:val="single" w:sz="4" w:space="0" w:color="auto"/>
+              <w:left w:val="single" w:sz="4" w:space="0" w:color="auto"/>
+              <w:bottom w:val="single" w:sz="4" w:space="0" w:color="auto"/>
+              <w:right w:val="single" w:sz="4" w:space="0" w:color="auto"/>
+            </w:tcBorders>
+            <w:vAlign w:val="center"/>
+          </w:tcPr>
+          <w:p>
+            <w:pPr>
+              <w:jc w:val="center"/>
+            </w:pPr>
           </w:p>
         </w:tc>
         <w:tc>
@@ -1332,136 +1578,13 @@
               <w:right w:val="single" w:sz="4" w:space="0" w:color="auto"/>
             </w:tcBorders>
             <w:vAlign w:val="center"/>
-            <w:hideMark/>
           </w:tcPr>
           <w:p>
             <w:pPr>
               <w:jc w:val="center"/>
-              <w:rPr>
-                <w:rFonts w:eastAsia="PMingLiU"/>
-                <w:b/>
-                <w:bCs/>
-                <w:sz w:val="16"/>
-                <w:szCs w:val="16"/>
-                <w:lang w:eastAsia="zh-TW"/>
-              </w:rPr>
-            </w:pPr>
-            <w:r>
-              <w:rPr>
-                <w:rFonts w:eastAsia="PMingLiU"/>
-                <w:b/>
-                <w:bCs/>
-                <w:sz w:val="16"/>
-                <w:szCs w:val="16"/>
-                <w:lang w:eastAsia="zh-TW"/>
-              </w:rPr>
-              <w:t>ODM</w:t>
-            </w:r>
-          </w:p>
-          <w:p>
-            <w:pPr>
-              <w:jc w:val="center"/>
-              <w:rPr>
-                <w:rFonts w:eastAsia="PMingLiU"/>
-                <w:b/>
-                <w:bCs/>
-                <w:sz w:val="16"/>
-                <w:szCs w:val="16"/>
-                <w:lang w:eastAsia="zh-TW"/>
-              </w:rPr>
-            </w:pPr>
-            <w:r>
-              <w:rPr>
-                <w:rFonts w:eastAsia="PMingLiU"/>
-                <w:b/>
-                <w:bCs/>
-                <w:sz w:val="16"/>
-                <w:szCs w:val="16"/>
-                <w:lang w:eastAsia="zh-TW"/>
-              </w:rPr>
-              <w:t>(Regional site)</w:t>
-            </w:r>
-          </w:p>
-        </w:tc>
-        <w:tc>
-          <w:tcPr>
-            <w:tcW w:w="1260" w:type="dxa"/>
-            <w:tcBorders>
-              <w:top w:val="single" w:sz="4" w:space="0" w:color="auto"/>
-              <w:left w:val="single" w:sz="4" w:space="0" w:color="auto"/>
-              <w:bottom w:val="single" w:sz="4" w:space="0" w:color="auto"/>
-              <w:right w:val="single" w:sz="4" w:space="0" w:color="auto"/>
-            </w:tcBorders>
-            <w:vAlign w:val="center"/>
-            <w:hideMark/>
-          </w:tcPr>
-          <w:p>
-            <w:pPr>
-              <w:jc w:val="center"/>
-              <w:rPr>
-                <w:rFonts w:eastAsia="PMingLiU"/>
-                <w:b/>
-                <w:bCs/>
-                <w:sz w:val="16"/>
-                <w:szCs w:val="16"/>
-                <w:lang w:eastAsia="zh-TW"/>
-              </w:rPr>
-            </w:pPr>
-            <w:r>
-              <w:rPr>
-                <w:rFonts w:eastAsia="PMingLiU"/>
-                <w:b/>
-                <w:bCs/>
-                <w:sz w:val="16"/>
-                <w:szCs w:val="16"/>
-                <w:lang w:eastAsia="zh-TW"/>
-              </w:rPr>
-              <w:t>Per-Unit Rebate Amount $USD</w:t>
-            </w:r>
-          </w:p>
-        </w:tc>
-        <w:tc>
-          <w:tcPr>
-            <w:tcW w:w="1170" w:type="dxa"/>
-            <w:tcBorders>
-              <w:top w:val="single" w:sz="4" w:space="0" w:color="auto"/>
-              <w:left w:val="single" w:sz="4" w:space="0" w:color="auto"/>
-              <w:bottom w:val="single" w:sz="4" w:space="0" w:color="auto"/>
-              <w:right w:val="single" w:sz="4" w:space="0" w:color="auto"/>
-            </w:tcBorders>
-            <w:vAlign w:val="center"/>
-            <w:hideMark/>
-          </w:tcPr>
-          <w:p>
-            <w:pPr>
-              <w:jc w:val="center"/>
-              <w:rPr>
-                <w:rFonts w:eastAsia="PMingLiU"/>
-                <w:b/>
-                <w:bCs/>
-                <w:sz w:val="16"/>
-                <w:szCs w:val="16"/>
-                <w:lang w:eastAsia="zh-TW"/>
-              </w:rPr>
-            </w:pPr>
-            <w:r>
-              <w:rPr>
-                <w:rFonts w:eastAsia="PMingLiU"/>
-                <w:b/>
-                <w:bCs/>
-                <w:sz w:val="16"/>
-                <w:szCs w:val="16"/>
-                <w:lang w:eastAsia="zh-TW"/>
-              </w:rPr>
-              <w:t>Rebate Period Start Date</w:t>
-            </w:r>
-          </w:p>
-        </w:tc>
-      </w:tr>
-      <w:tr>
-        <w:trPr>
-          <w:trHeight w:val="85"/>
-        </w:trPr>
+            </w:pPr>
+          </w:p>
+        </w:tc>
         <w:tc>
           <w:tcPr>
             <w:tcW w:w="900" w:type="dxa"/>
@@ -1476,10 +1599,6 @@
           <w:p>
             <w:pPr>
               <w:jc w:val="center"/>
-              <w:rPr>
-                <w:rFonts w:eastAsia="PMingLiU"/>
-                <w:lang w:eastAsia="zh-TW"/>
-              </w:rPr>
             </w:pPr>
           </w:p>
         </w:tc>
@@ -1500,9 +1619,14 @@
             </w:pPr>
           </w:p>
         </w:tc>
-        <w:tc>
-          <w:tcPr>
-            <w:tcW w:w="1530" w:type="dxa"/>
+      </w:tr>
+      <w:tr>
+        <w:trPr>
+          <w:trHeight w:val="85"/>
+        </w:trPr>
+        <w:tc>
+          <w:tcPr>
+            <w:tcW w:w="900" w:type="dxa"/>
             <w:tcBorders>
               <w:top w:val="single" w:sz="4" w:space="0" w:color="auto"/>
               <w:left w:val="single" w:sz="4" w:space="0" w:color="auto"/>
@@ -1514,12 +1638,33 @@
           <w:p>
             <w:pPr>
               <w:jc w:val="center"/>
-            </w:pPr>
-          </w:p>
-        </w:tc>
-        <w:tc>
-          <w:tcPr>
-            <w:tcW w:w="1710" w:type="dxa"/>
+              <w:rPr>
+                <w:rFonts w:eastAsia="PMingLiU"/>
+                <w:lang w:eastAsia="zh-TW"/>
+              </w:rPr>
+            </w:pPr>
+          </w:p>
+        </w:tc>
+        <w:tc>
+          <w:tcPr>
+            <w:tcW w:w="1350" w:type="dxa"/>
+            <w:tcBorders>
+              <w:top w:val="single" w:sz="4" w:space="0" w:color="auto"/>
+              <w:left w:val="single" w:sz="4" w:space="0" w:color="auto"/>
+              <w:bottom w:val="single" w:sz="4" w:space="0" w:color="auto"/>
+              <w:right w:val="single" w:sz="4" w:space="0" w:color="auto"/>
+            </w:tcBorders>
+            <w:vAlign w:val="center"/>
+          </w:tcPr>
+          <w:p>
+            <w:pPr>
+              <w:jc w:val="center"/>
+            </w:pPr>
+          </w:p>
+        </w:tc>
+        <w:tc>
+          <w:tcPr>
+            <w:tcW w:w="1620" w:type="dxa"/>
             <w:tcBorders>
               <w:top w:val="single" w:sz="4" w:space="0" w:color="auto"/>
               <w:left w:val="single" w:sz="4" w:space="0" w:color="auto"/>
@@ -1570,6 +1715,23 @@
         </w:tc>
         <w:tc>
           <w:tcPr>
+            <w:tcW w:w="1800" w:type="dxa"/>
+            <w:tcBorders>
+              <w:top w:val="single" w:sz="4" w:space="0" w:color="auto"/>
+              <w:left w:val="single" w:sz="4" w:space="0" w:color="auto"/>
+              <w:bottom w:val="single" w:sz="4" w:space="0" w:color="auto"/>
+              <w:right w:val="single" w:sz="4" w:space="0" w:color="auto"/>
+            </w:tcBorders>
+            <w:vAlign w:val="center"/>
+          </w:tcPr>
+          <w:p>
+            <w:pPr>
+              <w:jc w:val="center"/>
+            </w:pPr>
+          </w:p>
+        </w:tc>
+        <w:tc>
+          <w:tcPr>
             <w:tcW w:w="1350" w:type="dxa"/>
             <w:tcBorders>
               <w:top w:val="single" w:sz="4" w:space="0" w:color="auto"/>
@@ -1587,45 +1749,6 @@
         </w:tc>
         <w:tc>
           <w:tcPr>
-            <w:tcW w:w="1260" w:type="dxa"/>
-            <w:tcBorders>
-              <w:top w:val="single" w:sz="4" w:space="0" w:color="auto"/>
-              <w:left w:val="single" w:sz="4" w:space="0" w:color="auto"/>
-              <w:bottom w:val="single" w:sz="4" w:space="0" w:color="auto"/>
-              <w:right w:val="single" w:sz="4" w:space="0" w:color="auto"/>
-            </w:tcBorders>
-            <w:vAlign w:val="center"/>
-          </w:tcPr>
-          <w:p>
-            <w:pPr>
-              <w:jc w:val="center"/>
-            </w:pPr>
-          </w:p>
-        </w:tc>
-        <w:tc>
-          <w:tcPr>
-            <w:tcW w:w="1170" w:type="dxa"/>
-            <w:tcBorders>
-              <w:top w:val="single" w:sz="4" w:space="0" w:color="auto"/>
-              <w:left w:val="single" w:sz="4" w:space="0" w:color="auto"/>
-              <w:bottom w:val="single" w:sz="4" w:space="0" w:color="auto"/>
-              <w:right w:val="single" w:sz="4" w:space="0" w:color="auto"/>
-            </w:tcBorders>
-            <w:vAlign w:val="center"/>
-          </w:tcPr>
-          <w:p>
-            <w:pPr>
-              <w:jc w:val="center"/>
-            </w:pPr>
-          </w:p>
-        </w:tc>
-      </w:tr>
-      <w:tr>
-        <w:trPr>
-          <w:trHeight w:val="85"/>
-        </w:trPr>
-        <w:tc>
-          <w:tcPr>
             <w:tcW w:w="900" w:type="dxa"/>
             <w:tcBorders>
               <w:top w:val="single" w:sz="4" w:space="0" w:color="auto"/>
@@ -1638,135 +1761,12 @@
           <w:p>
             <w:pPr>
               <w:jc w:val="center"/>
-              <w:rPr>
-                <w:rFonts w:eastAsia="PMingLiU"/>
-                <w:lang w:eastAsia="zh-TW"/>
-              </w:rPr>
             </w:pPr>
           </w:p>
         </w:tc>
         <w:tc>
           <w:tcPr>
             <w:tcW w:w="1080" w:type="dxa"/>
-            <w:tcBorders>
-              <w:top w:val="single" w:sz="4" w:space="0" w:color="auto"/>
-              <w:left w:val="single" w:sz="4" w:space="0" w:color="auto"/>
-              <w:bottom w:val="single" w:sz="4" w:space="0" w:color="auto"/>
-              <w:right w:val="single" w:sz="4" w:space="0" w:color="auto"/>
-            </w:tcBorders>
-            <w:vAlign w:val="center"/>
-          </w:tcPr>
-          <w:p>
-            <w:pPr>
-              <w:jc w:val="center"/>
-            </w:pPr>
-          </w:p>
-        </w:tc>
-        <w:tc>
-          <w:tcPr>
-            <w:tcW w:w="1530" w:type="dxa"/>
-            <w:tcBorders>
-              <w:top w:val="single" w:sz="4" w:space="0" w:color="auto"/>
-              <w:left w:val="single" w:sz="4" w:space="0" w:color="auto"/>
-              <w:bottom w:val="single" w:sz="4" w:space="0" w:color="auto"/>
-              <w:right w:val="single" w:sz="4" w:space="0" w:color="auto"/>
-            </w:tcBorders>
-            <w:vAlign w:val="center"/>
-          </w:tcPr>
-          <w:p>
-            <w:pPr>
-              <w:jc w:val="center"/>
-            </w:pPr>
-          </w:p>
-        </w:tc>
-        <w:tc>
-          <w:tcPr>
-            <w:tcW w:w="1710" w:type="dxa"/>
-            <w:tcBorders>
-              <w:top w:val="single" w:sz="4" w:space="0" w:color="auto"/>
-              <w:left w:val="single" w:sz="4" w:space="0" w:color="auto"/>
-              <w:bottom w:val="single" w:sz="4" w:space="0" w:color="auto"/>
-              <w:right w:val="single" w:sz="4" w:space="0" w:color="auto"/>
-            </w:tcBorders>
-            <w:vAlign w:val="center"/>
-          </w:tcPr>
-          <w:p>
-            <w:pPr>
-              <w:jc w:val="center"/>
-            </w:pPr>
-          </w:p>
-        </w:tc>
-        <w:tc>
-          <w:tcPr>
-            <w:tcW w:w="990" w:type="dxa"/>
-            <w:tcBorders>
-              <w:top w:val="single" w:sz="4" w:space="0" w:color="auto"/>
-              <w:left w:val="single" w:sz="4" w:space="0" w:color="auto"/>
-              <w:bottom w:val="single" w:sz="4" w:space="0" w:color="auto"/>
-              <w:right w:val="single" w:sz="4" w:space="0" w:color="auto"/>
-            </w:tcBorders>
-            <w:vAlign w:val="center"/>
-          </w:tcPr>
-          <w:p>
-            <w:pPr>
-              <w:jc w:val="center"/>
-            </w:pPr>
-          </w:p>
-        </w:tc>
-        <w:tc>
-          <w:tcPr>
-            <w:tcW w:w="810" w:type="dxa"/>
-            <w:tcBorders>
-              <w:top w:val="single" w:sz="4" w:space="0" w:color="auto"/>
-              <w:left w:val="single" w:sz="4" w:space="0" w:color="auto"/>
-              <w:bottom w:val="single" w:sz="4" w:space="0" w:color="auto"/>
-              <w:right w:val="single" w:sz="4" w:space="0" w:color="auto"/>
-            </w:tcBorders>
-            <w:vAlign w:val="center"/>
-          </w:tcPr>
-          <w:p>
-            <w:pPr>
-              <w:jc w:val="center"/>
-            </w:pPr>
-          </w:p>
-        </w:tc>
-        <w:tc>
-          <w:tcPr>
-            <w:tcW w:w="1350" w:type="dxa"/>
-            <w:tcBorders>
-              <w:top w:val="single" w:sz="4" w:space="0" w:color="auto"/>
-              <w:left w:val="single" w:sz="4" w:space="0" w:color="auto"/>
-              <w:bottom w:val="single" w:sz="4" w:space="0" w:color="auto"/>
-              <w:right w:val="single" w:sz="4" w:space="0" w:color="auto"/>
-            </w:tcBorders>
-            <w:vAlign w:val="center"/>
-          </w:tcPr>
-          <w:p>
-            <w:pPr>
-              <w:jc w:val="center"/>
-            </w:pPr>
-          </w:p>
-        </w:tc>
-        <w:tc>
-          <w:tcPr>
-            <w:tcW w:w="1260" w:type="dxa"/>
-            <w:tcBorders>
-              <w:top w:val="single" w:sz="4" w:space="0" w:color="auto"/>
-              <w:left w:val="single" w:sz="4" w:space="0" w:color="auto"/>
-              <w:bottom w:val="single" w:sz="4" w:space="0" w:color="auto"/>
-              <w:right w:val="single" w:sz="4" w:space="0" w:color="auto"/>
-            </w:tcBorders>
-            <w:vAlign w:val="center"/>
-          </w:tcPr>
-          <w:p>
-            <w:pPr>
-              <w:jc w:val="center"/>
-            </w:pPr>
-          </w:p>
-        </w:tc>
-        <w:tc>
-          <w:tcPr>
-            <w:tcW w:w="1170" w:type="dxa"/>
             <w:tcBorders>
               <w:top w:val="single" w:sz="4" w:space="0" w:color="auto"/>
               <w:left w:val="single" w:sz="4" w:space="0" w:color="auto"/>
@@ -2354,7 +2354,7 @@
           <w:p>
             <w:pPr>
               <w:rPr>
-                <w:rFonts w:ascii="Arial" w:eastAsia="PMingLiU" w:hAnsi="Arial" w:cs="Arial" w:hint="eastAsia"/>
+                <w:rFonts w:ascii="Arial" w:eastAsia="PMingLiU" w:hAnsi="Arial" w:cs="Arial"/>
                 <w:lang w:eastAsia="zh-TW"/>
               </w:rPr>
             </w:pPr>
@@ -2523,7 +2523,7 @@
           <w:p>
             <w:pPr>
               <w:rPr>
-                <w:rFonts w:ascii="Arial" w:eastAsia="PMingLiU" w:hAnsi="Arial" w:cs="Arial" w:hint="eastAsia"/>
+                <w:rFonts w:ascii="Arial" w:eastAsia="PMingLiU" w:hAnsi="Arial" w:cs="Arial"/>
                 <w:lang w:eastAsia="zh-TW"/>
               </w:rPr>
             </w:pPr>
@@ -4545,6 +4545,21 @@
 </file>
 
 <file path=customXml/item1.xml><?xml version="1.0" encoding="utf-8"?>
+<p:properties xmlns:p="http://schemas.microsoft.com/office/2006/metadata/properties" xmlns:xsi="http://www.w3.org/2001/XMLSchema-instance">
+  <documentManagement>
+    <lcf76f155ced4ddcb4097134ff3c332f xmlns="3ddbdfa1-be50-4b7a-b66f-14c4748c8596">
+      <Terms xmlns="http://schemas.microsoft.com/office/infopath/2007/PartnerControls"/>
+    </lcf76f155ced4ddcb4097134ff3c332f>
+    <TaxCatchAll xmlns="2df2684a-2237-489e-8795-1f946593e18f" xsi:nil="true"/>
+  </documentManagement>
+</p:properties>
+</file>
+
+<file path=customXml/item2.xml><?xml version="1.0" encoding="utf-8"?>
+<b:Sources xmlns:b="http://schemas.openxmlformats.org/officeDocument/2006/bibliography" xmlns="http://schemas.openxmlformats.org/officeDocument/2006/bibliography" SelectedStyle="\APASixthEditionOfficeOnline.xsl" StyleName="APA" Version="6"/>
+</file>
+
+<file path=customXml/item3.xml><?xml version="1.0" encoding="utf-8"?>
 <?mso-contentType ?>
 <FormTemplates xmlns="http://schemas.microsoft.com/sharepoint/v3/contenttype/forms">
   <Display>DocumentLibraryForm</Display>
@@ -4553,7 +4568,7 @@
 </FormTemplates>
 </file>
 
-<file path=customXml/item2.xml><?xml version="1.0" encoding="utf-8"?>
+<file path=customXml/item4.xml><?xml version="1.0" encoding="utf-8"?>
 <ct:contentTypeSchema xmlns:ct="http://schemas.microsoft.com/office/2006/metadata/contentType" xmlns:ma="http://schemas.microsoft.com/office/2006/metadata/properties/metaAttributes" ct:_="" ma:_="" ma:contentTypeName="Document" ma:contentTypeID="0x010100C7BB62D9C7AC4249BB50D4F119F8FF50" ma:contentTypeVersion="14" ma:contentTypeDescription="Create a new document." ma:contentTypeScope="" ma:versionID="dab14850594d04436880d3464ba468af">
   <xsd:schema xmlns:xsd="http://www.w3.org/2001/XMLSchema" xmlns:xs="http://www.w3.org/2001/XMLSchema" xmlns:p="http://schemas.microsoft.com/office/2006/metadata/properties" xmlns:ns2="3ddbdfa1-be50-4b7a-b66f-14c4748c8596" xmlns:ns3="2df2684a-2237-489e-8795-1f946593e18f" targetNamespace="http://schemas.microsoft.com/office/2006/metadata/properties" ma:root="true" ma:fieldsID="eb8d2f689c1774a9065a5e99593f72e7" ns2:_="" ns3:_="">
     <xsd:import namespace="3ddbdfa1-be50-4b7a-b66f-14c4748c8596"/>
@@ -4782,22 +4797,26 @@
 </ct:contentTypeSchema>
 </file>
 
-<file path=customXml/item3.xml><?xml version="1.0" encoding="utf-8"?>
-<p:properties xmlns:p="http://schemas.microsoft.com/office/2006/metadata/properties" xmlns:xsi="http://www.w3.org/2001/XMLSchema-instance">
-  <documentManagement>
-    <lcf76f155ced4ddcb4097134ff3c332f xmlns="3ddbdfa1-be50-4b7a-b66f-14c4748c8596">
-      <Terms xmlns="http://schemas.microsoft.com/office/infopath/2007/PartnerControls"/>
-    </lcf76f155ced4ddcb4097134ff3c332f>
-    <TaxCatchAll xmlns="2df2684a-2237-489e-8795-1f946593e18f" xsi:nil="true"/>
-  </documentManagement>
-</p:properties>
+<file path=customXml/itemProps1.xml><?xml version="1.0" encoding="utf-8"?>
+<ds:datastoreItem xmlns:ds="http://schemas.openxmlformats.org/officeDocument/2006/customXml" ds:itemID="{A8D4C279-A7E0-4E9E-BDDB-F633470021CF}">
+  <ds:schemaRefs>
+    <ds:schemaRef ds:uri="http://schemas.microsoft.com/office/2006/metadata/properties"/>
+    <ds:schemaRef ds:uri="3ddbdfa1-be50-4b7a-b66f-14c4748c8596"/>
+    <ds:schemaRef ds:uri="http://schemas.microsoft.com/office/infopath/2007/PartnerControls"/>
+    <ds:schemaRef ds:uri="2df2684a-2237-489e-8795-1f946593e18f"/>
+  </ds:schemaRefs>
+</ds:datastoreItem>
 </file>
 
-<file path=customXml/item4.xml><?xml version="1.0" encoding="utf-8"?>
-<b:Sources xmlns:b="http://schemas.openxmlformats.org/officeDocument/2006/bibliography" xmlns="http://schemas.openxmlformats.org/officeDocument/2006/bibliography" SelectedStyle="\APASixthEditionOfficeOnline.xsl" StyleName="APA" Version="6"/>
+<file path=customXml/itemProps2.xml><?xml version="1.0" encoding="utf-8"?>
+<ds:datastoreItem xmlns:ds="http://schemas.openxmlformats.org/officeDocument/2006/customXml" ds:itemID="{11145C2C-7E9B-4186-B137-13DF4B649EAC}">
+  <ds:schemaRefs>
+    <ds:schemaRef ds:uri="http://schemas.openxmlformats.org/officeDocument/2006/bibliography"/>
+  </ds:schemaRefs>
+</ds:datastoreItem>
 </file>
 
-<file path=customXml/itemProps1.xml><?xml version="1.0" encoding="utf-8"?>
+<file path=customXml/itemProps3.xml><?xml version="1.0" encoding="utf-8"?>
 <ds:datastoreItem xmlns:ds="http://schemas.openxmlformats.org/officeDocument/2006/customXml" ds:itemID="{FFDB335C-122B-4C8E-B931-4F043DE30D9D}">
   <ds:schemaRefs>
     <ds:schemaRef ds:uri="http://schemas.microsoft.com/sharepoint/v3/contenttype/forms"/>
@@ -4805,7 +4824,7 @@
 </ds:datastoreItem>
 </file>
 
-<file path=customXml/itemProps2.xml><?xml version="1.0" encoding="utf-8"?>
+<file path=customXml/itemProps4.xml><?xml version="1.0" encoding="utf-8"?>
 <ds:datastoreItem xmlns:ds="http://schemas.openxmlformats.org/officeDocument/2006/customXml" ds:itemID="{020821EB-3E1B-4EB8-8007-9504BC8286C3}">
   <ds:schemaRefs>
     <ds:schemaRef ds:uri="http://schemas.microsoft.com/office/2006/metadata/contentType"/>
@@ -4822,23 +4841,4 @@
     <ds:schemaRef ds:uri="http://schemas.microsoft.com/internal/obd"/>
   </ds:schemaRefs>
 </ds:datastoreItem>
-</file>
-
-<file path=customXml/itemProps3.xml><?xml version="1.0" encoding="utf-8"?>
-<ds:datastoreItem xmlns:ds="http://schemas.openxmlformats.org/officeDocument/2006/customXml" ds:itemID="{A8D4C279-A7E0-4E9E-BDDB-F633470021CF}">
-  <ds:schemaRefs>
-    <ds:schemaRef ds:uri="http://schemas.microsoft.com/office/2006/metadata/properties"/>
-    <ds:schemaRef ds:uri="3ddbdfa1-be50-4b7a-b66f-14c4748c8596"/>
-    <ds:schemaRef ds:uri="http://schemas.microsoft.com/office/infopath/2007/PartnerControls"/>
-    <ds:schemaRef ds:uri="2df2684a-2237-489e-8795-1f946593e18f"/>
-  </ds:schemaRefs>
-</ds:datastoreItem>
-</file>
-
-<file path=customXml/itemProps4.xml><?xml version="1.0" encoding="utf-8"?>
-<ds:datastoreItem xmlns:ds="http://schemas.openxmlformats.org/officeDocument/2006/customXml" ds:itemID="{11145C2C-7E9B-4186-B137-13DF4B649EAC}">
-  <ds:schemaRefs>
-    <ds:schemaRef ds:uri="http://schemas.openxmlformats.org/officeDocument/2006/bibliography"/>
-  </ds:schemaRefs>
-</ds:datastoreItem>
 </file>
</xml_diff>